<commit_message>
Bai 2 va Bai 4
</commit_message>
<xml_diff>
--- a/22661681_MaiCongThanh_MinhChung.docx
+++ b/22661681_MaiCongThanh_MinhChung.docx
@@ -247,8 +247,54 @@
           <w:bCs/>
           <w:sz w:val="30"/>
           <w:szCs w:val="30"/>
+          <w:lang w:val="vi-VN"/>
         </w:rPr>
       </w:pPr>
+      <w:r>
+        <w:rPr>
+          <w:b/>
+          <w:bCs/>
+          <w:sz w:val="30"/>
+          <w:szCs w:val="30"/>
+          <w:lang w:val="vi-VN"/>
+        </w:rPr>
+        <w:lastRenderedPageBreak/>
+        <w:drawing>
+          <wp:inline distT="0" distB="0" distL="0" distR="0" wp14:anchorId="5BD1F706" wp14:editId="56382EF4">
+            <wp:extent cx="5731510" cy="3582035"/>
+            <wp:effectExtent l="0" t="0" r="2540" b="0"/>
+            <wp:docPr id="297463054" name="Picture 1"/>
+            <wp:cNvGraphicFramePr>
+              <a:graphicFrameLocks xmlns:a="http://schemas.openxmlformats.org/drawingml/2006/main" noChangeAspect="1"/>
+            </wp:cNvGraphicFramePr>
+            <a:graphic xmlns:a="http://schemas.openxmlformats.org/drawingml/2006/main">
+              <a:graphicData uri="http://schemas.openxmlformats.org/drawingml/2006/picture">
+                <pic:pic xmlns:pic="http://schemas.openxmlformats.org/drawingml/2006/picture">
+                  <pic:nvPicPr>
+                    <pic:cNvPr id="297463054" name=""/>
+                    <pic:cNvPicPr/>
+                  </pic:nvPicPr>
+                  <pic:blipFill>
+                    <a:blip r:embed="rId6"/>
+                    <a:stretch>
+                      <a:fillRect/>
+                    </a:stretch>
+                  </pic:blipFill>
+                  <pic:spPr>
+                    <a:xfrm>
+                      <a:off x="0" y="0"/>
+                      <a:ext cx="5731510" cy="3582035"/>
+                    </a:xfrm>
+                    <a:prstGeom prst="rect">
+                      <a:avLst/>
+                    </a:prstGeom>
+                  </pic:spPr>
+                </pic:pic>
+              </a:graphicData>
+            </a:graphic>
+          </wp:inline>
+        </w:drawing>
+      </w:r>
     </w:p>
     <w:p>
       <w:pPr>
@@ -268,7 +314,6 @@
           <w:szCs w:val="30"/>
           <w:lang w:val="vi-VN"/>
         </w:rPr>
-        <w:lastRenderedPageBreak/>
         <w:t xml:space="preserve">Bài </w:t>
       </w:r>
       <w:r>
@@ -278,7 +323,7 @@
           <w:sz w:val="30"/>
           <w:szCs w:val="30"/>
         </w:rPr>
-        <w:t>3</w:t>
+        <w:t>4</w:t>
       </w:r>
       <w:r>
         <w:rPr>
@@ -290,6 +335,69 @@
         </w:rPr>
         <w:t>:</w:t>
       </w:r>
+    </w:p>
+    <w:p>
+      <w:pPr>
+        <w:rPr>
+          <w:b/>
+          <w:bCs/>
+          <w:sz w:val="30"/>
+          <w:szCs w:val="30"/>
+        </w:rPr>
+      </w:pPr>
+      <w:r>
+        <w:rPr>
+          <w:b/>
+          <w:bCs/>
+          <w:sz w:val="30"/>
+          <w:szCs w:val="30"/>
+        </w:rPr>
+        <w:drawing>
+          <wp:inline distT="0" distB="0" distL="0" distR="0" wp14:anchorId="58324212" wp14:editId="3E459EB1">
+            <wp:extent cx="5731510" cy="3582035"/>
+            <wp:effectExtent l="0" t="0" r="2540" b="0"/>
+            <wp:docPr id="151752647" name="Picture 1"/>
+            <wp:cNvGraphicFramePr>
+              <a:graphicFrameLocks xmlns:a="http://schemas.openxmlformats.org/drawingml/2006/main" noChangeAspect="1"/>
+            </wp:cNvGraphicFramePr>
+            <a:graphic xmlns:a="http://schemas.openxmlformats.org/drawingml/2006/main">
+              <a:graphicData uri="http://schemas.openxmlformats.org/drawingml/2006/picture">
+                <pic:pic xmlns:pic="http://schemas.openxmlformats.org/drawingml/2006/picture">
+                  <pic:nvPicPr>
+                    <pic:cNvPr id="151752647" name=""/>
+                    <pic:cNvPicPr/>
+                  </pic:nvPicPr>
+                  <pic:blipFill>
+                    <a:blip r:embed="rId7"/>
+                    <a:stretch>
+                      <a:fillRect/>
+                    </a:stretch>
+                  </pic:blipFill>
+                  <pic:spPr>
+                    <a:xfrm>
+                      <a:off x="0" y="0"/>
+                      <a:ext cx="5731510" cy="3582035"/>
+                    </a:xfrm>
+                    <a:prstGeom prst="rect">
+                      <a:avLst/>
+                    </a:prstGeom>
+                  </pic:spPr>
+                </pic:pic>
+              </a:graphicData>
+            </a:graphic>
+          </wp:inline>
+        </w:drawing>
+      </w:r>
+    </w:p>
+    <w:p>
+      <w:pPr>
+        <w:rPr>
+          <w:b/>
+          <w:bCs/>
+          <w:sz w:val="30"/>
+          <w:szCs w:val="30"/>
+        </w:rPr>
+      </w:pPr>
     </w:p>
     <w:p>
       <w:pPr>

</xml_diff>